<commit_message>
Remove automatic log attachment from bug report email
NSSharingService(.composeEmail) only worked for Mail.app users with an
account configured, behaving inconsistently for the Gmail-web/Outlook-web
users this app targets. Back to a single mailto: flow that works the
same everywhere; the email body asks the user to attach the exported
diagnostics log manually.

Co-Authored-By: Claude Sonnet 4.6 <noreply@anthropic.com>
</commit_message>
<xml_diff>
--- a/Manuals/Modern Clipboard Quick Start.docx
+++ b/Manuals/Modern Clipboard Quick Start.docx
@@ -551,7 +551,7 @@
         <w:t xml:space="preserve">Preserve formatting when pasting</w:t>
       </w:r>
       <w:r>
-        <w:t xml:space="preserve"> is enabled in Preferences. Need plain text instead? Hold </w:t>
+        <w:t xml:space="preserve"> is enabled in Preferences. Want it to match the destination's existing style instead? Hold </w:t>
       </w:r>
       <w:r>
         <w:rPr>
@@ -561,7 +561,7 @@
         <w:t xml:space="preserve">⌥ Option</w:t>
       </w:r>
       <w:r>
-        <w:t xml:space="preserve"> (configurable) while pasting from the popup.</w:t>
+        <w:t xml:space="preserve"> (configurable) while pasting from the popup — this pastes plain text that takes on the formatting already in place where you're pasting.</w:t>
       </w:r>
     </w:p>
     <w:p>
@@ -973,7 +973,7 @@
       <w:r>
         <w:t xml:space="preserve">For the full feature reference, see the </w:t>
       </w:r>
-      <w:hyperlink w:history="1" r:id="rIddtz-rkonw3oo2ukbrdajc">
+      <w:hyperlink w:history="1" r:id="rIdb5vlwbu3go2xdi-tinpv1">
         <w:r>
           <w:rPr>
             <w:rStyle w:val="Hyperlink"/>

</xml_diff>